<commit_message>
committing doc and final code edits
</commit_message>
<xml_diff>
--- a/Milestone1/Milestone 1 Project Report dforkel.docx
+++ b/Milestone1/Milestone 1 Project Report dforkel.docx
@@ -144,15 +144,7 @@
           <w:szCs w:val="30"/>
           <w:u w:val="single"/>
         </w:rPr>
-        <w:t>URLs</w:t>
-      </w:r>
-      <w:r>
-        <w:rPr>
-          <w:sz w:val="30"/>
-          <w:szCs w:val="30"/>
-          <w:u w:val="single"/>
-        </w:rPr>
-        <w:t xml:space="preserve"> </w:t>
+        <w:t xml:space="preserve">URLs </w:t>
       </w:r>
     </w:p>
     <w:p>
@@ -371,13 +363,7 @@
         </w:drawing>
       </w:r>
       <w:r>
-        <w:t xml:space="preserve">^Screenshot </w:t>
-      </w:r>
-      <w:r>
-        <w:t>2</w:t>
-      </w:r>
-      <w:r>
-        <w:t xml:space="preserve">: </w:t>
+        <w:t xml:space="preserve">^Screenshot 2: </w:t>
       </w:r>
       <w:r>
         <w:t>Search Results Page</w:t>
@@ -391,13 +377,7 @@
         <w:jc w:val="center"/>
       </w:pPr>
       <w:r>
-        <w:t>This screenshot displays the information retrieved from the search.json fil</w:t>
-      </w:r>
-      <w:r>
-        <w:t>e</w:t>
-      </w:r>
-      <w:r>
-        <w:t>. JavaScript and jQuery are used to display the book titles, authors, publication years, edition counts, and other information. A loop is used to organize each book into its own section, with book covers and links to their Open Library records present as well.</w:t>
+        <w:t>This screenshot displays the information retrieved from the search.json file. JavaScript and jQuery are used to display the book titles, authors, publication years, edition counts, and other information. A loop is used to organize each book into its own section, with book covers and links to their Open Library records present as well.</w:t>
       </w:r>
     </w:p>
     <w:p/>

</xml_diff>